<commit_message>
fix: Word template zip used backslash paths, so Pandoc fell back to Aptos
The entries were stored as word\styles.xml; Pandoc looks up word/styles.xml and silently
used its own default theme. Repacked with forward slashes, and the style fonts are now
literal Times New Roman instead of theme references.

Co-Authored-By: Claude Opus 5.5 (1M context) <noreply@anthropic.com>
Claude-Session: https://claude.ai/code/session_01TzZuW4fZagApqTur59qQwb
</commit_message>
<xml_diff>
--- a/styles/manuscript-reference.docx
+++ b/styles/manuscript-reference.docx
@@ -1,43 +1,5 @@
 
-<file path=docProps\app.xml><?xml version="1.0" encoding="utf-8"?>
-<Properties xmlns="http://schemas.openxmlformats.org/officeDocument/2006/extended-properties" xmlns:vt="http://schemas.openxmlformats.org/officeDocument/2006/docPropsVTypes">
-  <Words>83</Words>
-  <SharedDoc>false</SharedDoc>
-  <HyperlinksChanged>false</HyperlinksChanged>
-  <Lines>12</Lines>
-  <AppVersion>12.0000</AppVersion>
-  <LinksUpToDate>false</LinksUpToDate>
-  <Application>Microsoft Word 12.0.0</Application>
-  <CharactersWithSpaces>583</CharactersWithSpaces>
-  <Template>Normal.dotm</Template>
-  <DocSecurity>0</DocSecurity>
-  <TotalTime>6</TotalTime>
-  <ScaleCrop>false</ScaleCrop>
-  <Characters>475</Characters>
-  <Paragraphs>8</Paragraphs>
-  <Pages>1</Pages>
-</Properties>
-</file>
-
-<file path=docProps\core.xml><?xml version="1.0" encoding="utf-8"?>
-<cp:coreProperties xmlns:cp="http://schemas.openxmlformats.org/package/2006/metadata/core-properties" xmlns:dc="http://purl.org/dc/elements/1.1/" xmlns:dcterms="http://purl.org/dc/terms/" xmlns:dcmitype="http://purl.org/dc/dcmitype/" xmlns:xsi="http://www.w3.org/2001/XMLSchema-instance">
-  <dc:title>Title</dc:title>
-  <dc:creator>Author</dc:creator>
-  <cp:keywords/>
-  <dcterms:created xsi:type="dcterms:W3CDTF">2017-12-27T05:22:50Z</dcterms:created>
-  <dcterms:modified xsi:type="dcterms:W3CDTF">2017-12-27T05:22:50Z</dcterms:modified>
-</cp:coreProperties>
-</file>
-
-<file path=docProps\custom.xml><?xml version="1.0" encoding="utf-8"?>
-<Properties xmlns="http://schemas.openxmlformats.org/officeDocument/2006/custom-properties" xmlns:vt="http://schemas.openxmlformats.org/officeDocument/2006/docPropsVTypes"/>
-</file>
-
-<file path=word\comments.xml><?xml version="1.0" encoding="utf-8"?>
-<w:comments xmlns:w="http://schemas.openxmlformats.org/wordprocessingml/2006/main" xmlns:m="http://schemas.openxmlformats.org/officeDocument/2006/math" xmlns:r="http://schemas.openxmlformats.org/officeDocument/2006/relationships" xmlns:o="urn:schemas-microsoft-com:office:office" xmlns:v="urn:schemas-microsoft-com:vml" xmlns:w10="urn:schemas-microsoft-com:office:word" xmlns:a="http://schemas.openxmlformats.org/drawingml/2006/main" xmlns:pic="http://schemas.openxmlformats.org/drawingml/2006/picture" xmlns:wp="http://schemas.openxmlformats.org/drawingml/2006/wordprocessingDrawing"/>
-</file>
-
-<file path=word\document.xml><?xml version="1.0" encoding="utf-8"?>
+<file path=word/document.xml><?xml version="1.0" encoding="utf-8"?>
 <w:document xmlns:w="http://schemas.openxmlformats.org/wordprocessingml/2006/main" xmlns:m="http://schemas.openxmlformats.org/officeDocument/2006/math" xmlns:r="http://schemas.openxmlformats.org/officeDocument/2006/relationships" xmlns:o="urn:schemas-microsoft-com:office:office" xmlns:v="urn:schemas-microsoft-com:vml" xmlns:w10="urn:schemas-microsoft-com:office:word" xmlns:a="http://schemas.openxmlformats.org/drawingml/2006/main" xmlns:pic="http://schemas.openxmlformats.org/drawingml/2006/picture" xmlns:wp="http://schemas.openxmlformats.org/drawingml/2006/wordprocessingDrawing">
   <w:body>
     <w:p>
@@ -360,61 +322,11 @@
 </w:document>
 </file>
 
-<file path=word\fontTable.xml><?xml version="1.0" encoding="utf-8"?>
-<w:fonts xmlns:r="http://schemas.openxmlformats.org/officeDocument/2006/relationships" xmlns:w="http://schemas.openxmlformats.org/wordprocessingml/2006/main">
-  <w:font w:name="Aptos">
-    <w:panose1 w:val="020B0004020202020204"/>
-    <w:charset w:val="00"/>
-    <w:family w:val="swiss"/>
-    <w:pitch w:val="variable"/>
-    <w:sig w:usb0="20000287" w:usb1="00000003" w:usb2="00000000" w:usb3="00000000" w:csb0="0000019F" w:csb1="00000000"/>
-  </w:font>
-  <w:font w:name="Times New Roman">
-    <w:panose1 w:val="02020603050405020304"/>
-    <w:charset w:val="00"/>
-    <w:family w:val="roman"/>
-    <w:pitch w:val="variable"/>
-    <w:sig w:usb0="E0002EFF" w:usb1="C000785B" w:usb2="00000009" w:usb3="00000000" w:csb0="000001FF" w:csb1="00000000"/>
-  </w:font>
-  <w:font w:name="Aptos Display">
-    <w:panose1 w:val="020B0004020202020204"/>
-    <w:charset w:val="00"/>
-    <w:family w:val="swiss"/>
-    <w:pitch w:val="variable"/>
-    <w:sig w:usb0="20000287" w:usb1="00000003" w:usb2="00000000" w:usb3="00000000" w:csb0="0000019F" w:csb1="00000000"/>
-  </w:font>
-  <w:font w:name="Cambria Math">
-    <w:panose1 w:val="02040503050406030204"/>
-    <w:charset w:val="00"/>
-    <w:family w:val="roman"/>
-    <w:pitch w:val="variable"/>
-    <w:sig w:usb0="E00002FF" w:usb1="420024FF" w:usb2="00000000" w:usb3="00000000" w:csb0="0000019F" w:csb1="00000000"/>
-  </w:font>
-  <w:font w:name="Courier New">
-    <w:panose1 w:val="02070309020205020404"/>
-    <w:charset w:val="00"/>
-    <w:family w:val="modern"/>
-    <w:pitch w:val="fixed"/>
-    <w:sig w:usb0="E0002AFF" w:usb1="C0007843" w:usb2="00000009" w:usb3="00000000" w:csb0="000001FF" w:csb1="00000000"/>
-  </w:font>
-  <w:font w:name="Cambria">
-    <w:panose1 w:val="02040503050406030204"/>
-    <w:charset w:val="00"/>
-    <w:family w:val="roman"/>
-    <w:pitch w:val="variable"/>
-    <w:sig w:usb0="E00002FF" w:usb1="400004FF" w:usb2="00000000" w:usb3="00000000" w:csb0="0000019F" w:csb1="00000000"/>
-  </w:font>
-  <w:font w:name="Calibri">
-    <w:panose1 w:val="020F0502020204030204"/>
-    <w:charset w:val="00"/>
-    <w:family w:val="swiss"/>
-    <w:pitch w:val="variable"/>
-    <w:sig w:usb0="E0002AFF" w:usb1="C000247B" w:usb2="00000009" w:usb3="00000000" w:csb0="000001FF" w:csb1="00000000"/>
-  </w:font>
-</w:fonts>
+<file path=word/comments.xml><?xml version="1.0" encoding="utf-8"?>
+<w:comments xmlns:w="http://schemas.openxmlformats.org/wordprocessingml/2006/main" xmlns:m="http://schemas.openxmlformats.org/officeDocument/2006/math" xmlns:r="http://schemas.openxmlformats.org/officeDocument/2006/relationships" xmlns:o="urn:schemas-microsoft-com:office:office" xmlns:v="urn:schemas-microsoft-com:vml" xmlns:w10="urn:schemas-microsoft-com:office:word" xmlns:a="http://schemas.openxmlformats.org/drawingml/2006/main" xmlns:pic="http://schemas.openxmlformats.org/drawingml/2006/picture" xmlns:wp="http://schemas.openxmlformats.org/drawingml/2006/wordprocessingDrawing"/>
 </file>
 
-<file path=word\footnotes.xml><?xml version="1.0" encoding="utf-8"?>
+<file path=word/footnotes.xml><?xml version="1.0" encoding="utf-8"?>
 <w:footnotes xmlns:w="http://schemas.openxmlformats.org/wordprocessingml/2006/main" xmlns:m="http://schemas.openxmlformats.org/officeDocument/2006/math" xmlns:r="http://schemas.openxmlformats.org/officeDocument/2006/relationships" xmlns:o="urn:schemas-microsoft-com:office:office" xmlns:v="urn:schemas-microsoft-com:vml" xmlns:w10="urn:schemas-microsoft-com:office:word" xmlns:a="http://schemas.openxmlformats.org/drawingml/2006/main" xmlns:pic="http://schemas.openxmlformats.org/drawingml/2006/picture" xmlns:wp="http://schemas.openxmlformats.org/drawingml/2006/wordprocessingDrawing">
   <w:footnote w:type="continuationSeparator" w:id="0">
     <w:p>
@@ -457,7 +369,7 @@
 </w:footnotes>
 </file>
 
-<file path=word\numbering.xml><?xml version="1.0" encoding="utf-8"?>
+<file path=word/numbering.xml><?xml version="1.0" encoding="utf-8"?>
 <w:numbering xmlns:w="http://schemas.openxmlformats.org/wordprocessingml/2006/main">
   <w:abstractNum w:abstractNumId="990">
     <w:nsid w:val="170cd2de"/>
@@ -568,51 +480,12 @@
 </w:numbering>
 </file>
 
-<file path=word\settings.xml><?xml version="1.0" encoding="utf-8"?>
-<w:settings xmlns:o="urn:schemas-microsoft-com:office:office" xmlns:r="http://schemas.openxmlformats.org/officeDocument/2006/relationships" xmlns:m="http://schemas.openxmlformats.org/officeDocument/2006/math" xmlns:v="urn:schemas-microsoft-com:vml" xmlns:w10="urn:schemas-microsoft-com:office:word" xmlns:w="http://schemas.openxmlformats.org/wordprocessingml/2006/main" xmlns:sl="http://schemas.openxmlformats.org/schemaLibrary/2006/main">
-  <w:zoom w:percent="100"/>
-  <w:embedSystemFonts/>
-  <w:proofState w:spelling="clean" w:grammar="clean"/>
-  <w:stylePaneFormatFilter w:val="0004"/>
-  <w:doNotTrackMoves/>
-  <w:defaultTabStop w:val="720"/>
-  <w:drawingGridHorizontalSpacing w:val="360"/>
-  <w:drawingGridVerticalSpacing w:val="360"/>
-  <w:displayHorizontalDrawingGridEvery w:val="0"/>
-  <w:displayVerticalDrawingGridEvery w:val="0"/>
-  <w:characterSpacingControl w:val="doNotCompress"/>
-  <w:savePreviewPicture/>
-  <w:footnotePr>
-    <w:footnote w:id="-1"/>
-    <w:footnote w:id="0"/>
-  </w:footnotePr>
-  <w:rsids>
-  </w:rsids>
-  <m:mathPr>
-    <m:mathFont m:val="Cambria Math"/>
-    <m:brkBin m:val="before"/>
-    <m:brkBinSub m:val="--"/>
-    <m:smallFrac m:val="0"/>
-    <m:dispDef/>
-    <m:lMargin m:val="0"/>
-    <m:rMargin m:val="0"/>
-    <m:wrapRight/>
-    <m:intLim m:val="subSup"/>
-    <m:naryLim m:val="undOvr"/>
-  </m:mathPr>
-  <w:themeFontLang w:val="en-US"/>
-  <w:clrSchemeMapping w:bg1="light1" w:t1="dark1" w:bg2="light2" w:t2="dark2" w:accent1="accent1" w:accent2="accent2" w:accent3="accent3" w:accent4="accent4" w:accent5="accent5" w:accent6="accent6" w:hyperlink="hyperlink" w:followedHyperlink="followedHyperlink"/>
-  <w:decimalSymbol w:val="."/>
-  <w:listSeparator w:val=","/>
-</w:settings>
-</file>
-
-<file path=word\styles.xml><?xml version="1.0" encoding="utf-8"?>
+<file path=word/styles.xml><?xml version="1.0" encoding="utf-8"?>
 <w:styles xmlns:r="http://schemas.openxmlformats.org/officeDocument/2006/relationships" xmlns:w="http://schemas.openxmlformats.org/wordprocessingml/2006/main">
   <w:docDefaults>
     <w:rPrDefault>
       <w:rPr>
-        <w:rFonts w:asciiTheme="minorHAnsi" w:eastAsiaTheme="minorHAnsi" w:hAnsiTheme="minorHAnsi" w:cstheme="minorBidi"/>
+        <w:rFonts w:ascii="Times New Roman" w:hAnsi="Times New Roman" w:cs="Times New Roman" w:eastAsiaTheme="minorHAnsi"/>
         <w:sz w:val="24"/>
         <w:szCs w:val="24"/>
         <w:lang w:val="en-US" w:eastAsia="en-US" w:bidi="ar-SA"/>
@@ -666,7 +539,7 @@
       <w:jc w:val="center"/>
     </w:pPr>
     <w:rPr>
-      <w:rFonts w:asciiTheme="majorHAnsi" w:eastAsiaTheme="majorEastAsia" w:hAnsiTheme="majorHAnsi" w:cstheme="majorBidi"/>
+      <w:rFonts w:ascii="Times New Roman" w:hAnsi="Times New Roman" w:cs="Times New Roman" w:eastAsiaTheme="majorEastAsia"/>
       <w:sz w:val="24"/>
       <w:szCs w:val="24"/>
     </w:rPr>
@@ -678,7 +551,7 @@
     <w:uiPriority w:val="10"/>
     <w:rsid w:val="00A10FD9"/>
     <w:rPr>
-      <w:rFonts w:asciiTheme="majorHAnsi" w:eastAsiaTheme="majorEastAsia" w:hAnsiTheme="majorHAnsi" w:cstheme="majorBidi"/>
+      <w:rFonts w:ascii="Times New Roman" w:hAnsi="Times New Roman" w:cs="Times New Roman" w:eastAsiaTheme="majorEastAsia"/>
       <w:sz w:val="24"/>
       <w:szCs w:val="24"/>
     </w:rPr>
@@ -697,7 +570,7 @@
       </w:numPr>
     </w:pPr>
     <w:rPr>
-      <w:rFonts w:eastAsiaTheme="majorEastAsia" w:cstheme="majorBidi"/>
+      <w:rFonts w:ascii="Times New Roman" w:hAnsi="Times New Roman" w:cs="Times New Roman" w:eastAsiaTheme="majorEastAsia"/>
       <w:spacing w:val="15"/>
       <w:sz w:val="24"/>
       <w:szCs w:val="24"/>
@@ -710,7 +583,7 @@
     <w:uiPriority w:val="11"/>
     <w:rsid w:val="00A10FD9"/>
     <w:rPr>
-      <w:rFonts w:eastAsiaTheme="majorEastAsia" w:cstheme="majorBidi"/>
+      <w:rFonts w:ascii="Times New Roman" w:hAnsi="Times New Roman" w:cs="Times New Roman" w:eastAsiaTheme="majorEastAsia"/>
       <w:color w:val="000000" w:themeColor="text1" w:themeTint="A6"/>
       <w:spacing w:val="15"/>
       <w:sz w:val="24"/>
@@ -800,7 +673,7 @@
       <w:outlineLvl w:val="0"/>
     </w:pPr>
     <w:rPr>
-      <w:rFonts w:asciiTheme="majorHAnsi" w:eastAsiaTheme="majorEastAsia" w:hAnsiTheme="majorHAnsi" w:cstheme="majorBidi"/>
+      <w:rFonts w:ascii="Times New Roman" w:hAnsi="Times New Roman" w:cs="Times New Roman" w:eastAsiaTheme="majorEastAsia"/>
       <w:color w:val="000000" w:themeColor="accent1" w:themeShade="BF"/>
       <w:sz w:val="24"/>
       <w:szCs w:val="24"/>
@@ -823,7 +696,7 @@
       <w:outlineLvl w:val="1"/>
     </w:pPr>
     <w:rPr>
-      <w:rFonts w:asciiTheme="majorHAnsi" w:eastAsiaTheme="majorEastAsia" w:hAnsiTheme="majorHAnsi" w:cstheme="majorBidi"/>
+      <w:rFonts w:ascii="Times New Roman" w:hAnsi="Times New Roman" w:cs="Times New Roman" w:eastAsiaTheme="majorEastAsia"/>
       <w:color w:val="000000" w:themeColor="accent1" w:themeShade="BF"/>
       <w:sz w:val="24"/>
       <w:szCs w:val="24"/>
@@ -846,7 +719,7 @@
       <w:outlineLvl w:val="2"/>
     </w:pPr>
     <w:rPr>
-      <w:rFonts w:eastAsiaTheme="majorEastAsia" w:cstheme="majorBidi"/>
+      <w:rFonts w:ascii="Times New Roman" w:hAnsi="Times New Roman" w:cs="Times New Roman" w:eastAsiaTheme="majorEastAsia"/>
       <w:color w:val="000000" w:themeColor="accent1" w:themeShade="BF"/>
       <w:sz w:val="24"/>
       <w:szCs w:val="24"/>
@@ -869,7 +742,7 @@
       <w:outlineLvl w:val="3"/>
     </w:pPr>
     <w:rPr>
-      <w:rFonts w:eastAsiaTheme="majorEastAsia" w:cstheme="majorBidi"/>
+      <w:rFonts w:ascii="Times New Roman" w:hAnsi="Times New Roman" w:cs="Times New Roman" w:eastAsiaTheme="majorEastAsia"/>
       <w:i/>
       <w:iCs/>
       <w:color w:val="000000" w:themeColor="accent1" w:themeShade="BF"/>
@@ -892,7 +765,7 @@
       <w:outlineLvl w:val="4"/>
     </w:pPr>
     <w:rPr>
-      <w:rFonts w:eastAsiaTheme="majorEastAsia" w:cstheme="majorBidi"/>
+      <w:rFonts w:ascii="Times New Roman" w:hAnsi="Times New Roman" w:cs="Times New Roman" w:eastAsiaTheme="majorEastAsia"/>
       <w:color w:val="000000" w:themeColor="accent1" w:themeShade="BF"/>
     </w:rPr>
   </w:style>
@@ -913,7 +786,7 @@
       <w:outlineLvl w:val="5"/>
     </w:pPr>
     <w:rPr>
-      <w:rFonts w:eastAsiaTheme="majorEastAsia" w:cstheme="majorBidi"/>
+      <w:rFonts w:ascii="Times New Roman" w:hAnsi="Times New Roman" w:cs="Times New Roman" w:eastAsiaTheme="majorEastAsia"/>
       <w:i/>
       <w:iCs/>
       <w:color w:val="000000" w:themeColor="text1" w:themeTint="A6"/>
@@ -936,7 +809,7 @@
       <w:outlineLvl w:val="6"/>
     </w:pPr>
     <w:rPr>
-      <w:rFonts w:eastAsiaTheme="majorEastAsia" w:cstheme="majorBidi"/>
+      <w:rFonts w:ascii="Times New Roman" w:hAnsi="Times New Roman" w:cs="Times New Roman" w:eastAsiaTheme="majorEastAsia"/>
       <w:color w:val="000000" w:themeColor="text1" w:themeTint="A6"/>
     </w:rPr>
   </w:style>
@@ -957,7 +830,7 @@
       <w:outlineLvl w:val="7"/>
     </w:pPr>
     <w:rPr>
-      <w:rFonts w:eastAsiaTheme="majorEastAsia" w:cstheme="majorBidi"/>
+      <w:rFonts w:ascii="Times New Roman" w:hAnsi="Times New Roman" w:cs="Times New Roman" w:eastAsiaTheme="majorEastAsia"/>
       <w:i/>
       <w:iCs/>
       <w:color w:val="000000" w:themeColor="text1" w:themeTint="D8"/>
@@ -980,7 +853,7 @@
       <w:outlineLvl w:val="8"/>
     </w:pPr>
     <w:rPr>
-      <w:rFonts w:eastAsiaTheme="majorEastAsia" w:cstheme="majorBidi"/>
+      <w:rFonts w:ascii="Times New Roman" w:hAnsi="Times New Roman" w:cs="Times New Roman" w:eastAsiaTheme="majorEastAsia"/>
       <w:color w:val="000000" w:themeColor="text1" w:themeTint="D8"/>
     </w:rPr>
   </w:style>
@@ -991,7 +864,7 @@
     <w:uiPriority w:val="9"/>
     <w:rsid w:val="00A10FD9"/>
     <w:rPr>
-      <w:rFonts w:asciiTheme="majorHAnsi" w:eastAsiaTheme="majorEastAsia" w:hAnsiTheme="majorHAnsi" w:cstheme="majorBidi"/>
+      <w:rFonts w:ascii="Times New Roman" w:hAnsi="Times New Roman" w:cs="Times New Roman" w:eastAsiaTheme="majorEastAsia"/>
       <w:color w:val="000000" w:themeColor="accent1" w:themeShade="BF"/>
       <w:sz w:val="24"/>
       <w:szCs w:val="24"/>
@@ -1005,7 +878,7 @@
     <w:semiHidden/>
     <w:rsid w:val="00A10FD9"/>
     <w:rPr>
-      <w:rFonts w:asciiTheme="majorHAnsi" w:eastAsiaTheme="majorEastAsia" w:hAnsiTheme="majorHAnsi" w:cstheme="majorBidi"/>
+      <w:rFonts w:ascii="Times New Roman" w:hAnsi="Times New Roman" w:cs="Times New Roman" w:eastAsiaTheme="majorEastAsia"/>
       <w:color w:val="000000" w:themeColor="accent1" w:themeShade="BF"/>
       <w:sz w:val="24"/>
       <w:szCs w:val="24"/>
@@ -1019,7 +892,7 @@
     <w:semiHidden/>
     <w:rsid w:val="00A10FD9"/>
     <w:rPr>
-      <w:rFonts w:eastAsiaTheme="majorEastAsia" w:cstheme="majorBidi"/>
+      <w:rFonts w:ascii="Times New Roman" w:hAnsi="Times New Roman" w:cs="Times New Roman" w:eastAsiaTheme="majorEastAsia"/>
       <w:color w:val="000000" w:themeColor="accent1" w:themeShade="BF"/>
       <w:sz w:val="24"/>
       <w:szCs w:val="24"/>
@@ -1033,7 +906,7 @@
     <w:semiHidden/>
     <w:rsid w:val="00A10FD9"/>
     <w:rPr>
-      <w:rFonts w:eastAsiaTheme="majorEastAsia" w:cstheme="majorBidi"/>
+      <w:rFonts w:ascii="Times New Roman" w:hAnsi="Times New Roman" w:cs="Times New Roman" w:eastAsiaTheme="majorEastAsia"/>
       <w:i/>
       <w:iCs/>
       <w:color w:val="000000" w:themeColor="accent1" w:themeShade="BF"/>
@@ -1047,7 +920,7 @@
     <w:semiHidden/>
     <w:rsid w:val="00A10FD9"/>
     <w:rPr>
-      <w:rFonts w:eastAsiaTheme="majorEastAsia" w:cstheme="majorBidi"/>
+      <w:rFonts w:ascii="Times New Roman" w:hAnsi="Times New Roman" w:cs="Times New Roman" w:eastAsiaTheme="majorEastAsia"/>
       <w:color w:val="000000" w:themeColor="accent1" w:themeShade="BF"/>
     </w:rPr>
   </w:style>
@@ -1059,7 +932,7 @@
     <w:semiHidden/>
     <w:rsid w:val="00A10FD9"/>
     <w:rPr>
-      <w:rFonts w:eastAsiaTheme="majorEastAsia" w:cstheme="majorBidi"/>
+      <w:rFonts w:ascii="Times New Roman" w:hAnsi="Times New Roman" w:cs="Times New Roman" w:eastAsiaTheme="majorEastAsia"/>
       <w:i/>
       <w:iCs/>
       <w:color w:val="000000" w:themeColor="text1" w:themeTint="A6"/>
@@ -1073,7 +946,7 @@
     <w:semiHidden/>
     <w:rsid w:val="00A10FD9"/>
     <w:rPr>
-      <w:rFonts w:eastAsiaTheme="majorEastAsia" w:cstheme="majorBidi"/>
+      <w:rFonts w:ascii="Times New Roman" w:hAnsi="Times New Roman" w:cs="Times New Roman" w:eastAsiaTheme="majorEastAsia"/>
       <w:color w:val="000000" w:themeColor="text1" w:themeTint="A6"/>
     </w:rPr>
   </w:style>
@@ -1085,7 +958,7 @@
     <w:semiHidden/>
     <w:rsid w:val="00A10FD9"/>
     <w:rPr>
-      <w:rFonts w:eastAsiaTheme="majorEastAsia" w:cstheme="majorBidi"/>
+      <w:rFonts w:ascii="Times New Roman" w:hAnsi="Times New Roman" w:cs="Times New Roman" w:eastAsiaTheme="majorEastAsia"/>
       <w:i/>
       <w:iCs/>
       <w:color w:val="000000" w:themeColor="text1" w:themeTint="D8"/>
@@ -1099,7 +972,7 @@
     <w:semiHidden/>
     <w:rsid w:val="00A10FD9"/>
     <w:rPr>
-      <w:rFonts w:eastAsiaTheme="majorEastAsia" w:cstheme="majorBidi"/>
+      <w:rFonts w:ascii="Times New Roman" w:hAnsi="Times New Roman" w:cs="Times New Roman" w:eastAsiaTheme="majorEastAsia"/>
       <w:color w:val="000000" w:themeColor="text1" w:themeTint="D8"/>
     </w:rPr>
   </w:style>
@@ -1264,7 +1137,7 @@
       <w:outlineLvl w:val="9"/>
     </w:pPr>
     <w:rPr>
-      <w:rFonts w:asciiTheme="majorHAnsi" w:eastAsiaTheme="majorEastAsia" w:hAnsiTheme="majorHAnsi" w:cstheme="majorBidi"/>
+      <w:rFonts w:ascii="Times New Roman" w:hAnsi="Times New Roman" w:cs="Times New Roman" w:eastAsiaTheme="majorEastAsia"/>
       <w:b w:val="0"/>
       <w:bCs w:val="0"/>
       <w:color w:val="000000" w:themeColor="accent1" w:themeShade="BF"/>
@@ -1273,7 +1146,7 @@
 </w:styles>
 </file>
 
-<file path=word\theme\theme1.xml><?xml version="1.0" encoding="utf-8"?>
+<file path=word/theme/theme1.xml><?xml version="1.0" encoding="utf-8"?>
 <a:theme xmlns:a="http://schemas.openxmlformats.org/drawingml/2006/main" name="Office Theme">
   <a:themeElements>
     <a:clrScheme name="Office">
@@ -1566,11 +1439,4 @@
     </a:ext>
   </a:extLst>
 </a:theme>
-</file>
-
-<file path=word\webSettings.xml><?xml version="1.0" encoding="utf-8"?>
-<ns0:webSettings xmlns:ns0="http://schemas.openxmlformats.org/wordprocessingml/2006/main">
-  <ns0:allowPNG/>
-  <ns0:doNotSaveAsSingleFile/>
-</ns0:webSettings>
 </file>
</xml_diff>